<commit_message>
added contract number ond org name in text
</commit_message>
<xml_diff>
--- a/contract_template.docx
+++ b/contract_template.docx
@@ -70,7 +70,18 @@
           <w:szCs w:val="22"/>
           <w:highlight w:val="yellow"/>
         </w:rPr>
-        <w:t>№______</w:t>
+        <w:t>№</w:t>
+      </w:r>
+      <w:r>
+        <w:rPr>
+          <w:rFonts w:cs="Times New Roman" w:ascii="Times New Roman" w:hAnsi="Times New Roman"/>
+          <w:b/>
+          <w:bCs/>
+          <w:sz w:val="22"/>
+          <w:szCs w:val="22"/>
+          <w:highlight w:val="yellow"/>
+        </w:rPr>
+        <w:t>contract_uuid</w:t>
       </w:r>
     </w:p>
     <w:p>
@@ -232,10 +243,12 @@
       </w:r>
       <w:r>
         <w:rPr>
-          <w:rFonts w:cs="Times New Roman" w:ascii="Times New Roman" w:hAnsi="Times New Roman"/>
+          <w:rFonts w:eastAsia="Calibri" w:cs="Times New Roman" w:ascii="Times New Roman" w:hAnsi="Times New Roman"/>
+          <w:sz w:val="22"/>
+          <w:szCs w:val="22"/>
           <w:highlight w:val="yellow"/>
         </w:rPr>
-        <w:t>Общество с ограниченной ответственностью (Индивидуальный предприниматель) ______________</w:t>
+        <w:t>customer_org_name</w:t>
       </w:r>
       <w:r>
         <w:rPr>
@@ -3379,6 +3392,20 @@
                 <w:rFonts w:ascii="Times New Roman" w:hAnsi="Times New Roman"/>
                 <w:highlight w:val="yellow"/>
               </w:rPr>
+            </w:r>
+          </w:p>
+          <w:p>
+            <w:pPr>
+              <w:pStyle w:val="Normal"/>
+              <w:rPr>
+                <w:rFonts w:ascii="Times New Roman" w:hAnsi="Times New Roman"/>
+              </w:rPr>
+            </w:pPr>
+            <w:r>
+              <w:rPr>
+                <w:rFonts w:ascii="Times New Roman" w:hAnsi="Times New Roman"/>
+                <w:highlight w:val="yellow"/>
+              </w:rPr>
               <w:t>customer_ogrn</w:t>
               <w:br/>
               <w:t>customer_inn</w:t>
@@ -3844,7 +3871,18 @@
           <w:szCs w:val="22"/>
           <w:highlight w:val="yellow"/>
         </w:rPr>
-        <w:t>№_____________</w:t>
+        <w:t>№</w:t>
+      </w:r>
+      <w:r>
+        <w:rPr>
+          <w:rFonts w:cs="Times New Roman" w:ascii="Times New Roman" w:hAnsi="Times New Roman"/>
+          <w:b/>
+          <w:bCs/>
+          <w:sz w:val="22"/>
+          <w:szCs w:val="22"/>
+          <w:highlight w:val="yellow"/>
+        </w:rPr>
+        <w:t>contract_uuid</w:t>
       </w:r>
       <w:r>
         <w:rPr>
@@ -3966,10 +4004,12 @@
       </w:r>
       <w:r>
         <w:rPr>
-          <w:rFonts w:cs="Times New Roman" w:ascii="Times New Roman" w:hAnsi="Times New Roman"/>
+          <w:rFonts w:eastAsia="Calibri" w:cs="Times New Roman" w:ascii="Times New Roman" w:hAnsi="Times New Roman"/>
+          <w:sz w:val="22"/>
+          <w:szCs w:val="22"/>
           <w:highlight w:val="yellow"/>
         </w:rPr>
-        <w:t>Общество с ограниченной ответственностью (ИП) ______________</w:t>
+        <w:t>customer_org_name</w:t>
       </w:r>
       <w:r>
         <w:rPr>
@@ -4133,9 +4173,31 @@
           <w:rFonts w:cs="Times New Roman" w:ascii="Times New Roman" w:hAnsi="Times New Roman"/>
           <w:b/>
           <w:bCs/>
+          <w:sz w:val="22"/>
+          <w:szCs w:val="22"/>
           <w:highlight w:val="yellow"/>
         </w:rPr>
-        <w:t>№_____________ от contract_date</w:t>
+        <w:t>№</w:t>
+      </w:r>
+      <w:r>
+        <w:rPr>
+          <w:rFonts w:cs="Times New Roman" w:ascii="Times New Roman" w:hAnsi="Times New Roman"/>
+          <w:b/>
+          <w:bCs/>
+          <w:sz w:val="22"/>
+          <w:szCs w:val="22"/>
+          <w:highlight w:val="yellow"/>
+        </w:rPr>
+        <w:t>contract_uuid</w:t>
+      </w:r>
+      <w:r>
+        <w:rPr>
+          <w:rFonts w:cs="Times New Roman" w:ascii="Times New Roman" w:hAnsi="Times New Roman"/>
+          <w:b/>
+          <w:bCs/>
+          <w:highlight w:val="yellow"/>
+        </w:rPr>
+        <w:t xml:space="preserve"> от contract_date</w:t>
       </w:r>
     </w:p>
     <w:p>
@@ -4214,14 +4276,25 @@
       </w:r>
       <w:r>
         <w:rPr>
-          <w:rFonts w:cs="Times New Roman" w:ascii="Times New Roman" w:hAnsi="Times New Roman"/>
+          <w:rFonts w:eastAsia="Calibri" w:cs="Times New Roman" w:ascii="Times New Roman" w:hAnsi="Times New Roman"/>
           <w:b/>
           <w:bCs/>
           <w:sz w:val="22"/>
           <w:szCs w:val="22"/>
           <w:highlight w:val="yellow"/>
         </w:rPr>
-        <w:t>№_________</w:t>
+        <w:t>№</w:t>
+      </w:r>
+      <w:r>
+        <w:rPr>
+          <w:rFonts w:eastAsia="Calibri" w:cs="Times New Roman" w:ascii="Times New Roman" w:hAnsi="Times New Roman"/>
+          <w:b/>
+          <w:bCs/>
+          <w:sz w:val="22"/>
+          <w:szCs w:val="22"/>
+          <w:highlight w:val="yellow"/>
+        </w:rPr>
+        <w:t>contract_uuid</w:t>
       </w:r>
       <w:r>
         <w:rPr>
@@ -4642,6 +4715,20 @@
                 <w:highlight w:val="yellow"/>
               </w:rPr>
               <w:t>customer_org_name</w:t>
+            </w:r>
+          </w:p>
+          <w:p>
+            <w:pPr>
+              <w:pStyle w:val="Normal"/>
+              <w:rPr>
+                <w:rFonts w:ascii="Times New Roman" w:hAnsi="Times New Roman"/>
+              </w:rPr>
+            </w:pPr>
+            <w:r>
+              <w:rPr>
+                <w:rFonts w:ascii="Times New Roman" w:hAnsi="Times New Roman"/>
+                <w:highlight w:val="yellow"/>
+              </w:rPr>
             </w:r>
           </w:p>
           <w:p>
@@ -4951,7 +5038,7 @@
     </w:r>
     <w:r>
       <w:rPr/>
-      <w:t>5</w:t>
+      <w:t>4</w:t>
     </w:r>
     <w:r>
       <w:rPr/>
@@ -4992,7 +5079,7 @@
     </w:r>
     <w:r>
       <w:rPr/>
-      <w:t>5</w:t>
+      <w:t>4</w:t>
     </w:r>
     <w:r>
       <w:rPr/>

</xml_diff>